<commit_message>
redid analysis excluding offline variables
</commit_message>
<xml_diff>
--- a/model output/moderation_assembly_NDA_cardinality.docx
+++ b/model output/moderation_assembly_NDA_cardinality.docx
@@ -5,19 +5,18 @@
     <w:tbl>
       <w:tblPr>
         <w:tblStyle w:val="Table"/>
-        <w:tblW w:type="pct" w:w="4818"/>
+        <w:tblW w:type="pct" w:w="4830"/>
         <w:tblLayout w:type="fixed"/>
         <w:tblLook w:firstRow="1" w:lastRow="1" w:firstColumn="0" w:lastColumn="0" w:noHBand="0" w:noVBand="0" w:val="0020"/>
       </w:tblPr>
       <w:tblGrid>
-        <w:gridCol w:w="1632"/>
-        <w:gridCol w:w="960"/>
-        <w:gridCol w:w="960"/>
-        <w:gridCol w:w="816"/>
-        <w:gridCol w:w="816"/>
-        <w:gridCol w:w="816"/>
-        <w:gridCol w:w="816"/>
-        <w:gridCol w:w="816"/>
+        <w:gridCol w:w="1831"/>
+        <w:gridCol w:w="1077"/>
+        <w:gridCol w:w="1077"/>
+        <w:gridCol w:w="915"/>
+        <w:gridCol w:w="915"/>
+        <w:gridCol w:w="915"/>
+        <w:gridCol w:w="915"/>
       </w:tblGrid>
       <w:tr>
         <w:trPr>
@@ -97,17 +96,6 @@
             </w:r>
           </w:p>
         </w:tc>
-        <w:tc>
-          <w:tcPr/>
-          <w:p>
-            <w:pPr>
-              <w:pStyle w:val="Compact"/>
-            </w:pPr>
-            <w:r>
-              <w:t xml:space="preserve">NDA meetings</w:t>
-            </w:r>
-          </w:p>
-        </w:tc>
       </w:tr>
       <w:tr>
         <w:tc>
@@ -128,7 +116,7 @@
               <w:pStyle w:val="Compact"/>
             </w:pPr>
             <w:r>
-              <w:t xml:space="preserve">18.652***</w:t>
+              <w:t xml:space="preserve">15.547***</w:t>
             </w:r>
           </w:p>
         </w:tc>
@@ -184,17 +172,6 @@
             </w:pPr>
             <w:r>
               <w:t xml:space="preserve">3.165***</w:t>
-            </w:r>
-          </w:p>
-        </w:tc>
-        <w:tc>
-          <w:tcPr/>
-          <w:p>
-            <w:pPr>
-              <w:pStyle w:val="Compact"/>
-            </w:pPr>
-            <w:r>
-              <w:t xml:space="preserve">3.105***</w:t>
             </w:r>
           </w:p>
         </w:tc>
@@ -215,7 +192,7 @@
               <w:pStyle w:val="Compact"/>
             </w:pPr>
             <w:r>
-              <w:t xml:space="preserve">18.652 (0.844)</w:t>
+              <w:t xml:space="preserve">15.547 (0.710)</w:t>
             </w:r>
           </w:p>
         </w:tc>
@@ -271,17 +248,6 @@
             </w:pPr>
             <w:r>
               <w:t xml:space="preserve">3.165 (0.179)</w:t>
-            </w:r>
-          </w:p>
-        </w:tc>
-        <w:tc>
-          <w:tcPr/>
-          <w:p>
-            <w:pPr>
-              <w:pStyle w:val="Compact"/>
-            </w:pPr>
-            <w:r>
-              <w:t xml:space="preserve">3.105 (0.173)</w:t>
             </w:r>
           </w:p>
         </w:tc>
@@ -305,7 +271,7 @@
               <w:pStyle w:val="Compact"/>
             </w:pPr>
             <w:r>
-              <w:t xml:space="preserve">3.122*</w:t>
+              <w:t xml:space="preserve">2.702*</w:t>
             </w:r>
           </w:p>
         </w:tc>
@@ -361,17 +327,6 @@
             </w:pPr>
             <w:r>
               <w:t xml:space="preserve">0.222</w:t>
-            </w:r>
-          </w:p>
-        </w:tc>
-        <w:tc>
-          <w:tcPr/>
-          <w:p>
-            <w:pPr>
-              <w:pStyle w:val="Compact"/>
-            </w:pPr>
-            <w:r>
-              <w:t xml:space="preserve">0.420</w:t>
             </w:r>
           </w:p>
         </w:tc>
@@ -392,7 +347,7 @@
               <w:pStyle w:val="Compact"/>
             </w:pPr>
             <w:r>
-              <w:t xml:space="preserve">3.122 (1.282)</w:t>
+              <w:t xml:space="preserve">2.702 (1.078)</w:t>
             </w:r>
           </w:p>
         </w:tc>
@@ -448,17 +403,6 @@
             </w:pPr>
             <w:r>
               <w:t xml:space="preserve">0.222 (0.272)</w:t>
-            </w:r>
-          </w:p>
-        </w:tc>
-        <w:tc>
-          <w:tcPr/>
-          <w:p>
-            <w:pPr>
-              <w:pStyle w:val="Compact"/>
-            </w:pPr>
-            <w:r>
-              <w:t xml:space="preserve">0.420 (0.262)</w:t>
             </w:r>
           </w:p>
         </w:tc>
@@ -482,7 +426,7 @@
               <w:pStyle w:val="Compact"/>
             </w:pPr>
             <w:r>
-              <w:t xml:space="preserve">-2.192*</w:t>
+              <w:t xml:space="preserve">-1.854*</w:t>
             </w:r>
           </w:p>
         </w:tc>
@@ -538,17 +482,6 @@
             </w:pPr>
             <w:r>
               <w:t xml:space="preserve">-0.380</w:t>
-            </w:r>
-          </w:p>
-        </w:tc>
-        <w:tc>
-          <w:tcPr/>
-          <w:p>
-            <w:pPr>
-              <w:pStyle w:val="Compact"/>
-            </w:pPr>
-            <w:r>
-              <w:t xml:space="preserve">-0.338</w:t>
             </w:r>
           </w:p>
         </w:tc>
@@ -569,7 +502,7 @@
               <w:pStyle w:val="Compact"/>
             </w:pPr>
             <w:r>
-              <w:t xml:space="preserve">-2.192 (1.103)</w:t>
+              <w:t xml:space="preserve">-1.854 (0.927)</w:t>
             </w:r>
           </w:p>
         </w:tc>
@@ -625,17 +558,6 @@
             </w:pPr>
             <w:r>
               <w:t xml:space="preserve">-0.380 (0.234)</w:t>
-            </w:r>
-          </w:p>
-        </w:tc>
-        <w:tc>
-          <w:tcPr/>
-          <w:p>
-            <w:pPr>
-              <w:pStyle w:val="Compact"/>
-            </w:pPr>
-            <w:r>
-              <w:t xml:space="preserve">-0.338 (0.226)</w:t>
             </w:r>
           </w:p>
         </w:tc>
@@ -659,7 +581,7 @@
               <w:pStyle w:val="Compact"/>
             </w:pPr>
             <w:r>
-              <w:t xml:space="preserve">-3.163+</w:t>
+              <w:t xml:space="preserve">-2.723+</w:t>
             </w:r>
           </w:p>
         </w:tc>
@@ -715,17 +637,6 @@
             </w:pPr>
             <w:r>
               <w:t xml:space="preserve">-0.275</w:t>
-            </w:r>
-          </w:p>
-        </w:tc>
-        <w:tc>
-          <w:tcPr/>
-          <w:p>
-            <w:pPr>
-              <w:pStyle w:val="Compact"/>
-            </w:pPr>
-            <w:r>
-              <w:t xml:space="preserve">-0.440</w:t>
             </w:r>
           </w:p>
         </w:tc>
@@ -746,7 +657,7 @@
               <w:pStyle w:val="Compact"/>
             </w:pPr>
             <w:r>
-              <w:t xml:space="preserve">-3.163 (1.663)</w:t>
+              <w:t xml:space="preserve">-2.723 (1.399)</w:t>
             </w:r>
           </w:p>
         </w:tc>
@@ -802,17 +713,6 @@
             </w:pPr>
             <w:r>
               <w:t xml:space="preserve">-0.275 (0.353)</w:t>
-            </w:r>
-          </w:p>
-        </w:tc>
-        <w:tc>
-          <w:tcPr/>
-          <w:p>
-            <w:pPr>
-              <w:pStyle w:val="Compact"/>
-            </w:pPr>
-            <w:r>
-              <w:t xml:space="preserve">-0.440 (0.340)</w:t>
             </w:r>
           </w:p>
         </w:tc>
@@ -895,17 +795,6 @@
             </w:r>
           </w:p>
         </w:tc>
-        <w:tc>
-          <w:tcPr/>
-          <w:p>
-            <w:pPr>
-              <w:pStyle w:val="Compact"/>
-            </w:pPr>
-            <w:r>
-              <w:t xml:space="preserve">260</w:t>
-            </w:r>
-          </w:p>
-        </w:tc>
       </w:tr>
       <w:tr>
         <w:tc>
@@ -926,7 +815,7 @@
               <w:pStyle w:val="Compact"/>
             </w:pPr>
             <w:r>
-              <w:t xml:space="preserve">0.088</w:t>
+              <w:t xml:space="preserve">0.090</w:t>
             </w:r>
           </w:p>
         </w:tc>
@@ -982,17 +871,6 @@
             </w:pPr>
             <w:r>
               <w:t xml:space="preserve">0.033</w:t>
-            </w:r>
-          </w:p>
-        </w:tc>
-        <w:tc>
-          <w:tcPr/>
-          <w:p>
-            <w:pPr>
-              <w:pStyle w:val="Compact"/>
-            </w:pPr>
-            <w:r>
-              <w:t xml:space="preserve">0.046</w:t>
             </w:r>
           </w:p>
         </w:tc>
@@ -1016,7 +894,7 @@
               <w:pStyle w:val="Compact"/>
             </w:pPr>
             <w:r>
-              <w:t xml:space="preserve">0.077</w:t>
+              <w:t xml:space="preserve">0.080</w:t>
             </w:r>
           </w:p>
         </w:tc>
@@ -1072,17 +950,6 @@
             </w:pPr>
             <w:r>
               <w:t xml:space="preserve">0.022</w:t>
-            </w:r>
-          </w:p>
-        </w:tc>
-        <w:tc>
-          <w:tcPr/>
-          <w:p>
-            <w:pPr>
-              <w:pStyle w:val="Compact"/>
-            </w:pPr>
-            <w:r>
-              <w:t xml:space="preserve">0.035</w:t>
             </w:r>
           </w:p>
         </w:tc>
@@ -1106,7 +973,7 @@
               <w:pStyle w:val="Compact"/>
             </w:pPr>
             <w:r>
-              <w:t xml:space="preserve">1720.3</w:t>
+              <w:t xml:space="preserve">1630.3</w:t>
             </w:r>
           </w:p>
         </w:tc>
@@ -1162,17 +1029,6 @@
             </w:pPr>
             <w:r>
               <w:t xml:space="preserve">914.6</w:t>
-            </w:r>
-          </w:p>
-        </w:tc>
-        <w:tc>
-          <w:tcPr/>
-          <w:p>
-            <w:pPr>
-              <w:pStyle w:val="Compact"/>
-            </w:pPr>
-            <w:r>
-              <w:t xml:space="preserve">895.6</w:t>
             </w:r>
           </w:p>
         </w:tc>
@@ -1196,7 +1052,7 @@
               <w:pStyle w:val="Compact"/>
             </w:pPr>
             <w:r>
-              <w:t xml:space="preserve">1738.1</w:t>
+              <w:t xml:space="preserve">1648.1</w:t>
             </w:r>
           </w:p>
         </w:tc>
@@ -1252,17 +1108,6 @@
             </w:pPr>
             <w:r>
               <w:t xml:space="preserve">932.4</w:t>
-            </w:r>
-          </w:p>
-        </w:tc>
-        <w:tc>
-          <w:tcPr/>
-          <w:p>
-            <w:pPr>
-              <w:pStyle w:val="Compact"/>
-            </w:pPr>
-            <w:r>
-              <w:t xml:space="preserve">913.4</w:t>
             </w:r>
           </w:p>
         </w:tc>
@@ -1286,7 +1131,7 @@
               <w:pStyle w:val="Compact"/>
             </w:pPr>
             <w:r>
-              <w:t xml:space="preserve">-855.164</w:t>
+              <w:t xml:space="preserve">-810.157</w:t>
             </w:r>
           </w:p>
         </w:tc>
@@ -1342,17 +1187,6 @@
             </w:pPr>
             <w:r>
               <w:t xml:space="preserve">-452.304</w:t>
-            </w:r>
-          </w:p>
-        </w:tc>
-        <w:tc>
-          <w:tcPr/>
-          <w:p>
-            <w:pPr>
-              <w:pStyle w:val="Compact"/>
-            </w:pPr>
-            <w:r>
-              <w:t xml:space="preserve">-442.809</w:t>
             </w:r>
           </w:p>
         </w:tc>
@@ -1376,7 +1210,7 @@
               <w:pStyle w:val="Compact"/>
             </w:pPr>
             <w:r>
-              <w:t xml:space="preserve">6.49</w:t>
+              <w:t xml:space="preserve">5.46</w:t>
             </w:r>
           </w:p>
         </w:tc>
@@ -1432,17 +1266,6 @@
             </w:pPr>
             <w:r>
               <w:t xml:space="preserve">1.38</w:t>
-            </w:r>
-          </w:p>
-        </w:tc>
-        <w:tc>
-          <w:tcPr/>
-          <w:p>
-            <w:pPr>
-              <w:pStyle w:val="Compact"/>
-            </w:pPr>
-            <w:r>
-              <w:t xml:space="preserve">1.33</w:t>
             </w:r>
           </w:p>
         </w:tc>
@@ -1450,7 +1273,7 @@
       <w:tr>
         <w:tc>
           <w:tcPr>
-            <w:gridSpan w:val="8"/>
+            <w:gridSpan w:val="7"/>
           </w:tcPr>
           <w:p>
             <w:pPr>

</xml_diff>